<commit_message>
feat: rediseño premium y optimización móvil del modal de productos
</commit_message>
<xml_diff>
--- a/docs/negocio/Dizi_Analisis_Estrategico.docx
+++ b/docs/negocio/Dizi_Analisis_Estrategico.docx
@@ -566,7 +566,7 @@
                 <w:sz w:val="48"/>
                 <w:szCs w:val="48"/>
               </w:rPr>
-              <w:t xml:space="preserve">S/ 29</w:t>
+              <w:t xml:space="preserve">desde S/9.90</w:t>
             </w:r>
           </w:p>
           <w:p>
@@ -871,7 +871,7 @@
                 <w:sz w:val="20"/>
                 <w:szCs w:val="20"/>
               </w:rPr>
-              <w:t xml:space="preserve">Precio competitivo: desde S/14.90/mes</w:t>
+              <w:t xml:space="preserve">Precio competitivo: desde S/9.90/mes</w:t>
             </w:r>
           </w:p>
           <w:p>
@@ -950,6 +950,84 @@
                 <w:szCs w:val="20"/>
               </w:rPr>
               <w:t xml:space="preserve">Dominio propio dizi.idenza.site activo y con SEO aplicado</w:t>
+            </w:r>
+          </w:p>
+          <w:p>
+            <w:pPr>
+              <w:spacing w:after="40" w:before="60"/>
+              <w:ind w:left="200"/>
+            </w:pPr>
+            <w:r>
+              <w:rPr>
+                <w:rFonts w:ascii="Arial" w:cs="Arial" w:eastAsia="Arial" w:hAnsi="Arial"/>
+                <w:b/>
+                <w:bCs/>
+                <w:color w:val="1A7A4A"/>
+                <w:sz w:val="20"/>
+                <w:szCs w:val="20"/>
+              </w:rPr>
+              <w:t xml:space="preserve">• </w:t>
+            </w:r>
+            <w:r>
+              <w:rPr>
+                <w:rFonts w:ascii="Arial" w:cs="Arial" w:eastAsia="Arial" w:hAnsi="Arial"/>
+                <w:color w:val="1A1A1A"/>
+                <w:sz w:val="20"/>
+                <w:szCs w:val="20"/>
+              </w:rPr>
+              <w:t xml:space="preserve">Panel superadmin con control de inactividad y liberación de URLs acaparadas</w:t>
+            </w:r>
+          </w:p>
+          <w:p>
+            <w:pPr>
+              <w:spacing w:after="40" w:before="60"/>
+              <w:ind w:left="200"/>
+            </w:pPr>
+            <w:r>
+              <w:rPr>
+                <w:rFonts w:ascii="Arial" w:cs="Arial" w:eastAsia="Arial" w:hAnsi="Arial"/>
+                <w:b/>
+                <w:bCs/>
+                <w:color w:val="1A7A4A"/>
+                <w:sz w:val="20"/>
+                <w:szCs w:val="20"/>
+              </w:rPr>
+              <w:t xml:space="preserve">• </w:t>
+            </w:r>
+            <w:r>
+              <w:rPr>
+                <w:rFonts w:ascii="Arial" w:cs="Arial" w:eastAsia="Arial" w:hAnsi="Arial"/>
+                <w:color w:val="1A1A1A"/>
+                <w:sz w:val="20"/>
+                <w:szCs w:val="20"/>
+              </w:rPr>
+              <w:t xml:space="preserve">Seguridad reforzada: aislamiento por tienda (RLS), CSP y HSTS aplicados</w:t>
+            </w:r>
+          </w:p>
+          <w:p>
+            <w:pPr>
+              <w:spacing w:after="40" w:before="60"/>
+              <w:ind w:left="200"/>
+            </w:pPr>
+            <w:r>
+              <w:rPr>
+                <w:rFonts w:ascii="Arial" w:cs="Arial" w:eastAsia="Arial" w:hAnsi="Arial"/>
+                <w:b/>
+                <w:bCs/>
+                <w:color w:val="1A7A4A"/>
+                <w:sz w:val="20"/>
+                <w:szCs w:val="20"/>
+              </w:rPr>
+              <w:t xml:space="preserve">• </w:t>
+            </w:r>
+            <w:r>
+              <w:rPr>
+                <w:rFonts w:ascii="Arial" w:cs="Arial" w:eastAsia="Arial" w:hAnsi="Arial"/>
+                <w:color w:val="1A1A1A"/>
+                <w:sz w:val="20"/>
+                <w:szCs w:val="20"/>
+              </w:rPr>
+              <w:t xml:space="preserve">Libro de Reclamaciones digital integrado (cumplimiento INDECOPI)</w:t>
             </w:r>
           </w:p>
         </w:tc>
@@ -1637,7 +1715,7 @@
           <w:sz w:val="21"/>
           <w:szCs w:val="21"/>
         </w:rPr>
-        <w:t xml:space="preserve">Dizi está en posición de atacar un mercado enorme con un producto validado y precio accesible. La ventaja real no es solo el catálogo sino la combinación única de catálogo + Bio-Link + Libro de Reclamaciones en una sola herramienta. Ningún competidor directo en Perú ofrece ese paquete a S/29/mes. La prioridad inmediata es resolver el onboarding manual y agregar prueba social antes de escalar con publicidad pagada.</w:t>
+        <w:t xml:space="preserve">Dizi está en posición de atacar un mercado enorme con un producto validado y precio accesible. La ventaja real no es solo el catálogo sino la combinación única de catálogo + Bio-Link + Libro de Reclamaciones en una sola herramienta. Ningún competidor directo en Perú ofrece ese paquete completo desde S/14.90/mes. La prioridad inmediata es resolver el onboarding manual y agregar prueba social antes de escalar con publicidad pagada.</w:t>
       </w:r>
     </w:p>
     <w:p>
@@ -2564,7 +2642,7 @@
                 <w:sz w:val="20"/>
                 <w:szCs w:val="20"/>
               </w:rPr>
-              <w:t xml:space="preserve">S/ 29 al mes sin problema si ve que le ahorra tiempo. Resistencia si no ve resultado en 2 semanas.</w:t>
+              <w:t xml:space="preserve">S/ 14.90 al mes sin problema si ve que le ahorra tiempo. Resistencia si no ve resultado en 2 semanas.</w:t>
             </w:r>
           </w:p>
         </w:tc>
@@ -3470,7 +3548,7 @@
                 <w:sz w:val="20"/>
                 <w:szCs w:val="20"/>
               </w:rPr>
-              <w:t xml:space="preserve">S/ 14.90 al mes (plan emprendedor). Sensible al precio, prefiere probar antes de comprometerse.</w:t>
+              <w:t xml:space="preserve">S/ 9.90 al mes (plan emprendedor). Sensible al precio, prefiere probar antes de comprometerse.</w:t>
             </w:r>
           </w:p>
         </w:tc>
@@ -4796,7 +4874,7 @@
                 <w:sz w:val="20"/>
                 <w:szCs w:val="20"/>
               </w:rPr>
-              <w:t xml:space="preserve">Desde S/14.90</w:t>
+              <w:t xml:space="preserve">Desde S/9.90</w:t>
             </w:r>
           </w:p>
         </w:tc>
@@ -5954,7 +6032,7 @@
           <w:sz w:val="21"/>
           <w:szCs w:val="21"/>
         </w:rPr>
-        <w:t xml:space="preserve">S/29/mes plan emprendedor, S/35 plan pro.</w:t>
+        <w:t xml:space="preserve">S/9.90/mes plan Emprendedor, S/14.90 plan Pro.</w:t>
       </w:r>
     </w:p>
     <w:p>
@@ -6218,7 +6296,7 @@
           <w:sz w:val="21"/>
           <w:szCs w:val="21"/>
         </w:rPr>
-        <w:t xml:space="preserve">100 clientes activos, MRR &gt; S/2,500.</w:t>
+        <w:t xml:space="preserve">100 clientes activos, MRR &gt; S/1,500.</w:t>
       </w:r>
     </w:p>
     <w:p>

</xml_diff>

<commit_message>
feat: add bio_show_catalog_button column to stores, update RPC get_public_store, and fix icon colors
</commit_message>
<xml_diff>
--- a/docs/negocio/Dizi_Analisis_Estrategico.docx
+++ b/docs/negocio/Dizi_Analisis_Estrategico.docx
@@ -106,7 +106,7 @@
           <w:sz w:val="20"/>
           <w:szCs w:val="20"/>
         </w:rPr>
-        <w:t xml:space="preserve">Mayo 2026</w:t>
+        <w:t>Junio 2026 · v1.4</w:t>
       </w:r>
     </w:p>
     <w:p>
@@ -4598,6 +4598,41 @@
           <w:szCs w:val="21"/>
         </w:rPr>
         <w:t xml:space="preserve">página de perfil con botón de WhatsApp directo, links y ubicación.</w:t>
+      </w:r>
+    </w:p>
+    <w:p>
+      <w:pPr>
+        <w:spacing w:after="60" w:before="60"/>
+        <w:ind w:left="360"/>
+      </w:pPr>
+      <w:r>
+        <w:rPr>
+          <w:rFonts w:ascii="Arial" w:cs="Arial" w:eastAsia="Arial" w:hAnsi="Arial"/>
+          <w:b/>
+          <w:bCs/>
+          <w:color w:val="E8590C"/>
+          <w:sz w:val="21"/>
+          <w:szCs w:val="21"/>
+        </w:rPr>
+        <w:t>• Crecimiento viral: cada catálogo lleva un anuncio nativo de Dizi y un enlace de referido que premia con 30 días premium gratis a quien invita y a quien se registra.</w:t>
+      </w:r>
+      <w:r>
+        <w:rPr>
+          <w:rFonts w:ascii="Arial" w:cs="Arial" w:eastAsia="Arial" w:hAnsi="Arial"/>
+          <w:b/>
+          <w:bCs/>
+          <w:color w:val="1A1A1A"/>
+          <w:sz w:val="21"/>
+          <w:szCs w:val="21"/>
+        </w:rPr>
+      </w:r>
+      <w:r>
+        <w:rPr>
+          <w:rFonts w:ascii="Arial" w:cs="Arial" w:eastAsia="Arial" w:hAnsi="Arial"/>
+          <w:color w:val="1A1A1A"/>
+          <w:sz w:val="21"/>
+          <w:szCs w:val="21"/>
+        </w:rPr>
       </w:r>
     </w:p>
     <w:p>
@@ -6243,11 +6278,6 @@
     </w:p>
     <w:p>
       <w:pPr>
-        <w:spacing w:after="0" w:before="120"/>
-      </w:pPr>
-    </w:p>
-    <w:p>
-      <w:pPr>
         <w:spacing w:after="100" w:before="300"/>
       </w:pPr>
       <w:r>
@@ -6259,161 +6289,8 @@
           <w:sz w:val="26"/>
           <w:szCs w:val="26"/>
         </w:rPr>
-        <w:t xml:space="preserve">Fase 3 — Expansión de nichos (Setiembre 2026 en adelante)</w:t>
-      </w:r>
-    </w:p>
-    <w:p>
-      <w:pPr>
-        <w:spacing w:after="60" w:before="60"/>
-        <w:ind w:left="360"/>
-      </w:pPr>
-      <w:r>
-        <w:rPr>
-          <w:rFonts w:ascii="Arial" w:cs="Arial" w:eastAsia="Arial" w:hAnsi="Arial"/>
-          <w:b/>
-          <w:bCs/>
-          <w:color w:val="E8590C"/>
-          <w:sz w:val="21"/>
-          <w:szCs w:val="21"/>
-        </w:rPr>
-        <w:t xml:space="preserve">• </w:t>
-      </w:r>
-      <w:r>
-        <w:rPr>
-          <w:rFonts w:ascii="Arial" w:cs="Arial" w:eastAsia="Arial" w:hAnsi="Arial"/>
-          <w:b/>
-          <w:bCs/>
-          <w:color w:val="1A1A1A"/>
-          <w:sz w:val="21"/>
-          <w:szCs w:val="21"/>
-        </w:rPr>
-        <w:t xml:space="preserve">Meta: </w:t>
-      </w:r>
-      <w:r>
-        <w:rPr>
-          <w:rFonts w:ascii="Arial" w:cs="Arial" w:eastAsia="Arial" w:hAnsi="Arial"/>
-          <w:color w:val="1A1A1A"/>
-          <w:sz w:val="21"/>
-          <w:szCs w:val="21"/>
-        </w:rPr>
-        <w:t xml:space="preserve">100 clientes activos, MRR &gt; S/1,500.</w:t>
-      </w:r>
-    </w:p>
-    <w:p>
-      <w:pPr>
-        <w:spacing w:after="60" w:before="60"/>
-        <w:ind w:left="360"/>
-      </w:pPr>
-      <w:r>
-        <w:rPr>
-          <w:rFonts w:ascii="Arial" w:cs="Arial" w:eastAsia="Arial" w:hAnsi="Arial"/>
-          <w:b/>
-          <w:bCs/>
-          <w:color w:val="E8590C"/>
-          <w:sz w:val="21"/>
-          <w:szCs w:val="21"/>
-        </w:rPr>
-        <w:t xml:space="preserve">• </w:t>
-      </w:r>
-      <w:r>
-        <w:rPr>
-          <w:rFonts w:ascii="Arial" w:cs="Arial" w:eastAsia="Arial" w:hAnsi="Arial"/>
-          <w:b/>
-          <w:bCs/>
-          <w:color w:val="1A1A1A"/>
-          <w:sz w:val="21"/>
-          <w:szCs w:val="21"/>
-        </w:rPr>
-        <w:t xml:space="preserve">Nicho 2: </w:t>
-      </w:r>
-      <w:r>
-        <w:rPr>
-          <w:rFonts w:ascii="Arial" w:cs="Arial" w:eastAsia="Arial" w:hAnsi="Arial"/>
-          <w:color w:val="1A1A1A"/>
-          <w:sz w:val="21"/>
-          <w:szCs w:val="21"/>
-        </w:rPr>
-        <w:t xml:space="preserve">Florerías y tiendas de ropa (Instagram Ads).</w:t>
-      </w:r>
-    </w:p>
-    <w:p>
-      <w:pPr>
-        <w:spacing w:after="60" w:before="60"/>
-        <w:ind w:left="360"/>
-      </w:pPr>
-      <w:r>
-        <w:rPr>
-          <w:rFonts w:ascii="Arial" w:cs="Arial" w:eastAsia="Arial" w:hAnsi="Arial"/>
-          <w:b/>
-          <w:bCs/>
-          <w:color w:val="E8590C"/>
-          <w:sz w:val="21"/>
-          <w:szCs w:val="21"/>
-        </w:rPr>
-        <w:t xml:space="preserve">• </w:t>
-      </w:r>
-      <w:r>
-        <w:rPr>
-          <w:rFonts w:ascii="Arial" w:cs="Arial" w:eastAsia="Arial" w:hAnsi="Arial"/>
-          <w:b/>
-          <w:bCs/>
-          <w:color w:val="1A1A1A"/>
-          <w:sz w:val="21"/>
-          <w:szCs w:val="21"/>
-        </w:rPr>
-        <w:t xml:space="preserve">Nicho 3: </w:t>
-      </w:r>
-      <w:r>
-        <w:rPr>
-          <w:rFonts w:ascii="Arial" w:cs="Arial" w:eastAsia="Arial" w:hAnsi="Arial"/>
-          <w:color w:val="1A1A1A"/>
-          <w:sz w:val="21"/>
-          <w:szCs w:val="21"/>
-        </w:rPr>
-        <w:t xml:space="preserve">Clínicas y servicios de salud (Google Ads).</w:t>
-      </w:r>
-    </w:p>
-    <w:p>
-      <w:pPr>
-        <w:spacing w:after="60" w:before="60"/>
-        <w:ind w:left="360"/>
-      </w:pPr>
-      <w:r>
-        <w:rPr>
-          <w:rFonts w:ascii="Arial" w:cs="Arial" w:eastAsia="Arial" w:hAnsi="Arial"/>
-          <w:b/>
-          <w:bCs/>
-          <w:color w:val="E8590C"/>
-          <w:sz w:val="21"/>
-          <w:szCs w:val="21"/>
-        </w:rPr>
-        <w:t xml:space="preserve">• </w:t>
-      </w:r>
-      <w:r>
-        <w:rPr>
-          <w:rFonts w:ascii="Arial" w:cs="Arial" w:eastAsia="Arial" w:hAnsi="Arial"/>
-          <w:b/>
-          <w:bCs/>
-          <w:color w:val="1A1A1A"/>
-          <w:sz w:val="21"/>
-          <w:szCs w:val="21"/>
-        </w:rPr>
-        <w:t xml:space="preserve">Canal nuevo: </w:t>
-      </w:r>
-      <w:r>
-        <w:rPr>
-          <w:rFonts w:ascii="Arial" w:cs="Arial" w:eastAsia="Arial" w:hAnsi="Arial"/>
-          <w:color w:val="1A1A1A"/>
-          <w:sz w:val="21"/>
-          <w:szCs w:val="21"/>
-        </w:rPr>
-        <w:t xml:space="preserve">Revendedores: agencias como Idenza que ofrecen Dizi a sus clientes.</w:t>
-      </w:r>
-    </w:p>
-    <w:p>
-      <w:pPr>
-        <w:spacing w:after="0" w:before="120"/>
-      </w:pPr>
+        <w:t>Motor de Crecimiento PLG — Loop Viral por Referidos (activo desde V1.4)</w:t>
+      </w:r>
     </w:p>
     <w:p>
       <w:pPr>
@@ -6428,6 +6305,279 @@
           <w:sz w:val="26"/>
           <w:szCs w:val="26"/>
         </w:rPr>
+        <w:t>• Cada catálogo público muestra un anuncio nativo de Dizi y, al cerrar una venta, una tarjeta posventa con el enlace de registro del comercio (?ref=slug).</w:t>
+      </w:r>
+    </w:p>
+    <w:p>
+      <w:pPr>
+        <w:spacing w:after="100" w:before="300"/>
+      </w:pPr>
+      <w:r>
+        <w:rPr>
+          <w:rFonts w:ascii="Arial" w:cs="Arial" w:eastAsia="Arial" w:hAnsi="Arial"/>
+          <w:b/>
+          <w:bCs/>
+          <w:color w:val="1A1A1A"/>
+          <w:sz w:val="26"/>
+          <w:szCs w:val="26"/>
+        </w:rPr>
+        <w:t>• Incentivo por tiempo (no dinero): el negocio referido recibe 30 días premium gratis; el referente recibe 30 días gratis (upgrade automático si está en Semilla, o prórroga si ya paga).</w:t>
+      </w:r>
+    </w:p>
+    <w:p>
+      <w:pPr>
+        <w:spacing w:after="100" w:before="300"/>
+      </w:pPr>
+      <w:r>
+        <w:rPr>
+          <w:rFonts w:ascii="Arial" w:cs="Arial" w:eastAsia="Arial" w:hAnsi="Arial"/>
+          <w:b/>
+          <w:bCs/>
+          <w:color w:val="1A1A1A"/>
+          <w:sz w:val="26"/>
+          <w:szCs w:val="26"/>
+        </w:rPr>
+        <w:t>• El loop se autoalimenta: más tiendas → más catálogos circulando → más compradores expuestos → más registros, bajando el CAC con cada ciclo.</w:t>
+      </w:r>
+    </w:p>
+    <w:p>
+      <w:pPr>
+        <w:spacing w:after="100" w:before="300"/>
+      </w:pPr>
+      <w:r>
+        <w:rPr>
+          <w:rFonts w:ascii="Arial" w:cs="Arial" w:eastAsia="Arial" w:hAnsi="Arial"/>
+          <w:b/>
+          <w:bCs/>
+          <w:color w:val="1A1A1A"/>
+          <w:sz w:val="26"/>
+          <w:szCs w:val="26"/>
+        </w:rPr>
+        <w:t>• Operación: gestionable desde el panel /super/referidos (auditoría de referidos y extensión manual de días premium).</w:t>
+      </w:r>
+    </w:p>
+    <w:p>
+      <w:pPr>
+        <w:spacing w:after="0" w:before="120"/>
+      </w:pPr>
+    </w:p>
+    <w:p>
+      <w:pPr>
+        <w:spacing w:after="100" w:before="300"/>
+      </w:pPr>
+      <w:r>
+        <w:rPr>
+          <w:rFonts w:ascii="Arial" w:cs="Arial" w:eastAsia="Arial" w:hAnsi="Arial"/>
+          <w:b/>
+          <w:bCs/>
+          <w:color w:val="1A1A1A"/>
+          <w:sz w:val="26"/>
+          <w:szCs w:val="26"/>
+        </w:rPr>
+        <w:t xml:space="preserve">Fase 3 — Expansión de nichos (Setiembre 2026 en adelante)</w:t>
+      </w:r>
+    </w:p>
+    <w:p>
+      <w:pPr>
+        <w:spacing w:after="60" w:before="60"/>
+        <w:ind w:left="360"/>
+      </w:pPr>
+      <w:r>
+        <w:rPr>
+          <w:rFonts w:ascii="Arial" w:cs="Arial" w:eastAsia="Arial" w:hAnsi="Arial"/>
+          <w:b/>
+          <w:bCs/>
+          <w:color w:val="E8590C"/>
+          <w:sz w:val="21"/>
+          <w:szCs w:val="21"/>
+        </w:rPr>
+        <w:t xml:space="preserve">• </w:t>
+      </w:r>
+      <w:r>
+        <w:rPr>
+          <w:rFonts w:ascii="Arial" w:cs="Arial" w:eastAsia="Arial" w:hAnsi="Arial"/>
+          <w:b/>
+          <w:bCs/>
+          <w:color w:val="1A1A1A"/>
+          <w:sz w:val="21"/>
+          <w:szCs w:val="21"/>
+        </w:rPr>
+        <w:t xml:space="preserve">Meta: </w:t>
+      </w:r>
+      <w:r>
+        <w:rPr>
+          <w:rFonts w:ascii="Arial" w:cs="Arial" w:eastAsia="Arial" w:hAnsi="Arial"/>
+          <w:color w:val="1A1A1A"/>
+          <w:sz w:val="21"/>
+          <w:szCs w:val="21"/>
+        </w:rPr>
+        <w:t xml:space="preserve">100 clientes activos, MRR &gt; S/1,500.</w:t>
+      </w:r>
+    </w:p>
+    <w:p>
+      <w:pPr>
+        <w:spacing w:after="60" w:before="60"/>
+        <w:ind w:left="360"/>
+      </w:pPr>
+      <w:r>
+        <w:rPr>
+          <w:rFonts w:ascii="Arial" w:cs="Arial" w:eastAsia="Arial" w:hAnsi="Arial"/>
+          <w:b/>
+          <w:bCs/>
+          <w:color w:val="E8590C"/>
+          <w:sz w:val="21"/>
+          <w:szCs w:val="21"/>
+        </w:rPr>
+        <w:t xml:space="preserve">• </w:t>
+      </w:r>
+      <w:r>
+        <w:rPr>
+          <w:rFonts w:ascii="Arial" w:cs="Arial" w:eastAsia="Arial" w:hAnsi="Arial"/>
+          <w:b/>
+          <w:bCs/>
+          <w:color w:val="1A1A1A"/>
+          <w:sz w:val="21"/>
+          <w:szCs w:val="21"/>
+        </w:rPr>
+        <w:t xml:space="preserve">Nicho 2: </w:t>
+      </w:r>
+      <w:r>
+        <w:rPr>
+          <w:rFonts w:ascii="Arial" w:cs="Arial" w:eastAsia="Arial" w:hAnsi="Arial"/>
+          <w:color w:val="1A1A1A"/>
+          <w:sz w:val="21"/>
+          <w:szCs w:val="21"/>
+        </w:rPr>
+        <w:t xml:space="preserve">Florerías y tiendas de ropa (Instagram Ads).</w:t>
+      </w:r>
+    </w:p>
+    <w:p>
+      <w:pPr>
+        <w:spacing w:after="60" w:before="60"/>
+        <w:ind w:left="360"/>
+      </w:pPr>
+      <w:r>
+        <w:rPr>
+          <w:rFonts w:ascii="Arial" w:cs="Arial" w:eastAsia="Arial" w:hAnsi="Arial"/>
+          <w:b/>
+          <w:bCs/>
+          <w:color w:val="E8590C"/>
+          <w:sz w:val="21"/>
+          <w:szCs w:val="21"/>
+        </w:rPr>
+        <w:t xml:space="preserve">• </w:t>
+      </w:r>
+      <w:r>
+        <w:rPr>
+          <w:rFonts w:ascii="Arial" w:cs="Arial" w:eastAsia="Arial" w:hAnsi="Arial"/>
+          <w:b/>
+          <w:bCs/>
+          <w:color w:val="1A1A1A"/>
+          <w:sz w:val="21"/>
+          <w:szCs w:val="21"/>
+        </w:rPr>
+        <w:t xml:space="preserve">Nicho 3: </w:t>
+      </w:r>
+      <w:r>
+        <w:rPr>
+          <w:rFonts w:ascii="Arial" w:cs="Arial" w:eastAsia="Arial" w:hAnsi="Arial"/>
+          <w:color w:val="1A1A1A"/>
+          <w:sz w:val="21"/>
+          <w:szCs w:val="21"/>
+        </w:rPr>
+        <w:t xml:space="preserve">Clínicas y servicios de salud (Google Ads).</w:t>
+      </w:r>
+    </w:p>
+    <w:p>
+      <w:pPr>
+        <w:spacing w:after="60" w:before="60"/>
+        <w:ind w:left="360"/>
+      </w:pPr>
+      <w:r>
+        <w:rPr>
+          <w:rFonts w:ascii="Arial" w:cs="Arial" w:eastAsia="Arial" w:hAnsi="Arial"/>
+          <w:b/>
+          <w:bCs/>
+          <w:color w:val="E8590C"/>
+          <w:sz w:val="21"/>
+          <w:szCs w:val="21"/>
+        </w:rPr>
+        <w:t>• Coeficiente viral (K): nuevos registros que genera cada tienda vía su enlace de referido. Meta: K que reduzca progresivamente el CAC pagado.</w:t>
+      </w:r>
+      <w:r>
+        <w:rPr>
+          <w:rFonts w:ascii="Arial" w:cs="Arial" w:eastAsia="Arial" w:hAnsi="Arial"/>
+          <w:b/>
+          <w:bCs/>
+          <w:color w:val="1A1A1A"/>
+          <w:sz w:val="21"/>
+          <w:szCs w:val="21"/>
+        </w:rPr>
+      </w:r>
+      <w:r>
+        <w:rPr>
+          <w:rFonts w:ascii="Arial" w:cs="Arial" w:eastAsia="Arial" w:hAnsi="Arial"/>
+          <w:color w:val="1A1A1A"/>
+          <w:sz w:val="21"/>
+          <w:szCs w:val="21"/>
+        </w:rPr>
+      </w:r>
+    </w:p>
+    <w:p>
+      <w:pPr>
+        <w:spacing w:after="60" w:before="60"/>
+        <w:ind w:left="360"/>
+      </w:pPr>
+      <w:r>
+        <w:rPr>
+          <w:rFonts w:ascii="Arial" w:cs="Arial" w:eastAsia="Arial" w:hAnsi="Arial"/>
+          <w:b/>
+          <w:bCs/>
+          <w:color w:val="E8590C"/>
+          <w:sz w:val="21"/>
+          <w:szCs w:val="21"/>
+        </w:rPr>
+        <w:t xml:space="preserve">• </w:t>
+      </w:r>
+      <w:r>
+        <w:rPr>
+          <w:rFonts w:ascii="Arial" w:cs="Arial" w:eastAsia="Arial" w:hAnsi="Arial"/>
+          <w:b/>
+          <w:bCs/>
+          <w:color w:val="1A1A1A"/>
+          <w:sz w:val="21"/>
+          <w:szCs w:val="21"/>
+        </w:rPr>
+        <w:t xml:space="preserve">Canal nuevo: </w:t>
+      </w:r>
+      <w:r>
+        <w:rPr>
+          <w:rFonts w:ascii="Arial" w:cs="Arial" w:eastAsia="Arial" w:hAnsi="Arial"/>
+          <w:color w:val="1A1A1A"/>
+          <w:sz w:val="21"/>
+          <w:szCs w:val="21"/>
+        </w:rPr>
+        <w:t xml:space="preserve">Revendedores: agencias como Idenza que ofrecen Dizi a sus clientes.</w:t>
+      </w:r>
+    </w:p>
+    <w:p>
+      <w:pPr>
+        <w:spacing w:after="0" w:before="120"/>
+      </w:pPr>
+    </w:p>
+    <w:p>
+      <w:pPr>
+        <w:spacing w:after="100" w:before="300"/>
+      </w:pPr>
+      <w:r>
+        <w:rPr>
+          <w:rFonts w:ascii="Arial" w:cs="Arial" w:eastAsia="Arial" w:hAnsi="Arial"/>
+          <w:b/>
+          <w:bCs/>
+          <w:color w:val="1A1A1A"/>
+          <w:sz w:val="26"/>
+          <w:szCs w:val="26"/>
+        </w:rPr>
         <w:t xml:space="preserve">Métricas clave a seguir desde hoy</w:t>
       </w:r>
     </w:p>
@@ -6635,7 +6785,7 @@
           <w:sz w:val="18"/>
           <w:szCs w:val="18"/>
         </w:rPr>
-        <w:t xml:space="preserve">Dizi · dizi.idenza.site · Catálogos digitales para MYPEs peruanas · Mayo 2026</w:t>
+        <w:t>Dizi · dizi.idenza.site · Catálogos digitales para MYPEs peruanas · Junio 2026</w:t>
       </w:r>
     </w:p>
     <w:sectPr>

</xml_diff>